<commit_message>
docs(lab1): embed requirement diagrams
</commit_message>
<xml_diff>
--- a/实验一_智能化需求工程与UML建模/01_需求获取计划与访谈剧本.docx
+++ b/实验一_智能化需求工程与UML建模/01_需求获取计划与访谈剧本.docx
@@ -2594,6 +2594,66 @@
       </w:tr>
     </w:tbl>
     <w:p/>
+    <w:p>
+      <w:r>
+        <w:br w:type="page"/>
+      </w:r>
+    </w:p>
+    <w:p>
+      <w:pPr>
+        <w:pStyle w:val="1"/>
+      </w:pPr>
+      <w:r>
+        <w:t>图示补充（本次补图）</w:t>
+      </w:r>
+    </w:p>
+    <w:p>
+      <w:pPr>
+        <w:jc w:val="center"/>
+      </w:pPr>
+      <w:r>
+        <w:drawing>
+          <wp:inline xmlns:a="http://schemas.openxmlformats.org/drawingml/2006/main" xmlns:pic="http://schemas.openxmlformats.org/drawingml/2006/picture">
+            <wp:extent cx="5760720" cy="3420427"/>
+            <wp:docPr id="1" name="Picture 1"/>
+            <wp:cNvGraphicFramePr>
+              <a:graphicFrameLocks noChangeAspect="1"/>
+            </wp:cNvGraphicFramePr>
+            <a:graphic>
+              <a:graphicData uri="http://schemas.openxmlformats.org/drawingml/2006/picture">
+                <pic:pic>
+                  <pic:nvPicPr>
+                    <pic:cNvPr id="0" name="lab1_stakeholder_map.png"/>
+                    <pic:cNvPicPr/>
+                  </pic:nvPicPr>
+                  <pic:blipFill>
+                    <a:blip r:embed="rId10"/>
+                    <a:stretch>
+                      <a:fillRect/>
+                    </a:stretch>
+                  </pic:blipFill>
+                  <pic:spPr>
+                    <a:xfrm>
+                      <a:off x="0" y="0"/>
+                      <a:ext cx="5760720" cy="3420427"/>
+                    </a:xfrm>
+                    <a:prstGeom prst="rect"/>
+                  </pic:spPr>
+                </pic:pic>
+              </a:graphicData>
+            </a:graphic>
+          </wp:inline>
+        </w:drawing>
+      </w:r>
+    </w:p>
+    <w:p>
+      <w:pPr>
+        <w:jc w:val="center"/>
+      </w:pPr>
+      <w:r>
+        <w:t>图1-1 需求获取干系人地图</w:t>
+      </w:r>
+    </w:p>
     <w:sectPr>
       <w:pgSz w:w="12240" w:h="15840"/>
       <w:pgMar w:top="1134" w:right="1247" w:bottom="1134" w:left="1247" w:header="720" w:footer="720" w:gutter="0"/>

</xml_diff>

<commit_message>
docs(lab1): position diagrams in template sections
</commit_message>
<xml_diff>
--- a/实验一_智能化需求工程与UML建模/01_需求获取计划与访谈剧本.docx
+++ b/实验一_智能化需求工程与UML建模/01_需求获取计划与访谈剧本.docx
@@ -1084,6 +1084,58 @@
           <w:p>
             <w:r>
               <w:t>v1.0 初稿：完成干系人分析、访谈计划、访谈剧本与 AI 模拟访谈 Prompt。</w:t>
+            </w:r>
+          </w:p>
+          <w:p>
+            <w:pPr>
+              <w:spacing w:before="0" w:after="0"/>
+            </w:pPr>
+          </w:p>
+          <w:p>
+            <w:pPr>
+              <w:jc w:val="center"/>
+            </w:pPr>
+            <w:r>
+              <w:drawing>
+                <wp:inline xmlns:a="http://schemas.openxmlformats.org/drawingml/2006/main" xmlns:pic="http://schemas.openxmlformats.org/drawingml/2006/picture">
+                  <wp:extent cx="4983480" cy="2958941"/>
+                  <wp:docPr id="1" name="Picture 1"/>
+                  <wp:cNvGraphicFramePr>
+                    <a:graphicFrameLocks noChangeAspect="1"/>
+                  </wp:cNvGraphicFramePr>
+                  <a:graphic>
+                    <a:graphicData uri="http://schemas.openxmlformats.org/drawingml/2006/picture">
+                      <pic:pic>
+                        <pic:nvPicPr>
+                          <pic:cNvPr id="0" name="image.png"/>
+                          <pic:cNvPicPr/>
+                        </pic:nvPicPr>
+                        <pic:blipFill>
+                          <a:blip r:embed="rId10"/>
+                          <a:stretch>
+                            <a:fillRect/>
+                          </a:stretch>
+                        </pic:blipFill>
+                        <pic:spPr>
+                          <a:xfrm>
+                            <a:off x="0" y="0"/>
+                            <a:ext cx="4983480" cy="2958941"/>
+                          </a:xfrm>
+                          <a:prstGeom prst="rect"/>
+                        </pic:spPr>
+                      </pic:pic>
+                    </a:graphicData>
+                  </a:graphic>
+                </wp:inline>
+              </w:drawing>
+            </w:r>
+          </w:p>
+          <w:p>
+            <w:pPr>
+              <w:jc w:val="center"/>
+            </w:pPr>
+            <w:r>
+              <w:t>图1-1 需求获取干系人地图</w:t>
             </w:r>
           </w:p>
         </w:tc>
@@ -2594,66 +2646,6 @@
       </w:tr>
     </w:tbl>
     <w:p/>
-    <w:p>
-      <w:r>
-        <w:br w:type="page"/>
-      </w:r>
-    </w:p>
-    <w:p>
-      <w:pPr>
-        <w:pStyle w:val="1"/>
-      </w:pPr>
-      <w:r>
-        <w:t>图示补充（本次补图）</w:t>
-      </w:r>
-    </w:p>
-    <w:p>
-      <w:pPr>
-        <w:jc w:val="center"/>
-      </w:pPr>
-      <w:r>
-        <w:drawing>
-          <wp:inline xmlns:a="http://schemas.openxmlformats.org/drawingml/2006/main" xmlns:pic="http://schemas.openxmlformats.org/drawingml/2006/picture">
-            <wp:extent cx="5760720" cy="3420427"/>
-            <wp:docPr id="1" name="Picture 1"/>
-            <wp:cNvGraphicFramePr>
-              <a:graphicFrameLocks noChangeAspect="1"/>
-            </wp:cNvGraphicFramePr>
-            <a:graphic>
-              <a:graphicData uri="http://schemas.openxmlformats.org/drawingml/2006/picture">
-                <pic:pic>
-                  <pic:nvPicPr>
-                    <pic:cNvPr id="0" name="lab1_stakeholder_map.png"/>
-                    <pic:cNvPicPr/>
-                  </pic:nvPicPr>
-                  <pic:blipFill>
-                    <a:blip r:embed="rId10"/>
-                    <a:stretch>
-                      <a:fillRect/>
-                    </a:stretch>
-                  </pic:blipFill>
-                  <pic:spPr>
-                    <a:xfrm>
-                      <a:off x="0" y="0"/>
-                      <a:ext cx="5760720" cy="3420427"/>
-                    </a:xfrm>
-                    <a:prstGeom prst="rect"/>
-                  </pic:spPr>
-                </pic:pic>
-              </a:graphicData>
-            </a:graphic>
-          </wp:inline>
-        </w:drawing>
-      </w:r>
-    </w:p>
-    <w:p>
-      <w:pPr>
-        <w:jc w:val="center"/>
-      </w:pPr>
-      <w:r>
-        <w:t>图1-1 需求获取干系人地图</w:t>
-      </w:r>
-    </w:p>
     <w:sectPr>
       <w:pgSz w:w="12240" w:h="15840"/>
       <w:pgMar w:top="1134" w:right="1247" w:bottom="1134" w:left="1247" w:header="720" w:footer="720" w:gutter="0"/>

</xml_diff>

<commit_message>
docs(lab1): fix onion model placement
</commit_message>
<xml_diff>
--- a/实验一_智能化需求工程与UML建模/01_需求获取计划与访谈剧本.docx
+++ b/实验一_智能化需求工程与UML建模/01_需求获取计划与访谈剧本.docx
@@ -1086,58 +1086,6 @@
               <w:t>v1.0 初稿：完成干系人分析、访谈计划、访谈剧本与 AI 模拟访谈 Prompt。</w:t>
             </w:r>
           </w:p>
-          <w:p>
-            <w:pPr>
-              <w:spacing w:before="0" w:after="0"/>
-            </w:pPr>
-          </w:p>
-          <w:p>
-            <w:pPr>
-              <w:jc w:val="center"/>
-            </w:pPr>
-            <w:r>
-              <w:drawing>
-                <wp:inline xmlns:a="http://schemas.openxmlformats.org/drawingml/2006/main" xmlns:pic="http://schemas.openxmlformats.org/drawingml/2006/picture">
-                  <wp:extent cx="4983480" cy="2958941"/>
-                  <wp:docPr id="1" name="Picture 1"/>
-                  <wp:cNvGraphicFramePr>
-                    <a:graphicFrameLocks noChangeAspect="1"/>
-                  </wp:cNvGraphicFramePr>
-                  <a:graphic>
-                    <a:graphicData uri="http://schemas.openxmlformats.org/drawingml/2006/picture">
-                      <pic:pic>
-                        <pic:nvPicPr>
-                          <pic:cNvPr id="0" name="image.png"/>
-                          <pic:cNvPicPr/>
-                        </pic:nvPicPr>
-                        <pic:blipFill>
-                          <a:blip r:embed="rId10"/>
-                          <a:stretch>
-                            <a:fillRect/>
-                          </a:stretch>
-                        </pic:blipFill>
-                        <pic:spPr>
-                          <a:xfrm>
-                            <a:off x="0" y="0"/>
-                            <a:ext cx="4983480" cy="2958941"/>
-                          </a:xfrm>
-                          <a:prstGeom prst="rect"/>
-                        </pic:spPr>
-                      </pic:pic>
-                    </a:graphicData>
-                  </a:graphic>
-                </wp:inline>
-              </w:drawing>
-            </w:r>
-          </w:p>
-          <w:p>
-            <w:pPr>
-              <w:jc w:val="center"/>
-            </w:pPr>
-            <w:r>
-              <w:t>图1-1 需求获取干系人地图</w:t>
-            </w:r>
-          </w:p>
         </w:tc>
       </w:tr>
     </w:tbl>
@@ -1329,28 +1277,63 @@
             <w:shd w:val="clear" w:color="auto" w:fill="FBFDFB"/>
           </w:tcPr>
           <w:p>
+            <w:pPr>
+              <w:jc w:val="left"/>
+            </w:pPr>
             <w:r>
-              <w:t>Onion Model 文字版：</w:t>
+              <w:t>Onion Model 图：</w:t>
+            </w:r>
+          </w:p>
+          <w:p>
+            <w:pPr>
+              <w:jc w:val="center"/>
+            </w:pPr>
+            <w:r>
+              <w:drawing>
+                <wp:inline xmlns:a="http://schemas.openxmlformats.org/drawingml/2006/main" xmlns:pic="http://schemas.openxmlformats.org/drawingml/2006/picture">
+                  <wp:extent cx="5120640" cy="3520440"/>
+                  <wp:docPr id="1" name="Picture 1"/>
+                  <wp:cNvGraphicFramePr>
+                    <a:graphicFrameLocks noChangeAspect="1"/>
+                  </wp:cNvGraphicFramePr>
+                  <a:graphic>
+                    <a:graphicData uri="http://schemas.openxmlformats.org/drawingml/2006/picture">
+                      <pic:pic>
+                        <pic:nvPicPr>
+                          <pic:cNvPr id="0" name="lab1_stakeholder_map.png"/>
+                          <pic:cNvPicPr/>
+                        </pic:nvPicPr>
+                        <pic:blipFill>
+                          <a:blip r:embed="rId11"/>
+                          <a:stretch>
+                            <a:fillRect/>
+                          </a:stretch>
+                        </pic:blipFill>
+                        <pic:spPr>
+                          <a:xfrm>
+                            <a:off x="0" y="0"/>
+                            <a:ext cx="5120640" cy="3520440"/>
+                          </a:xfrm>
+                          <a:prstGeom prst="rect"/>
+                        </pic:spPr>
+                      </pic:pic>
+                    </a:graphicData>
+                  </a:graphic>
+                </wp:inline>
+              </w:drawing>
+            </w:r>
+          </w:p>
+          <w:p>
+            <w:pPr>
+              <w:jc w:val="center"/>
+            </w:pPr>
+            <w:r>
+              <w:t>图1-1 需求洋葱图（Onion Model）</w:t>
             </w:r>
           </w:p>
           <w:p>
             <w:r>
-              <w:t>1. 核心层：顾客、注册会员、店员、猫咪管家，他们直接使用系统并产生关键业务数据。</w:t>
-            </w:r>
-          </w:p>
-          <w:p>
-            <w:r>
-              <w:t>2. 业务层：店长、门店运营人员、总部运营总监，他们关注门店效率、活动转化和跨门店经营指标。</w:t>
-            </w:r>
-          </w:p>
-          <w:p>
-            <w:r>
-              <w:t>3. 支撑层：支付服务商、短信/小程序平台、地图服务商、数据分析平台，提供支付、通知、定位与报表能力。</w:t>
-            </w:r>
-          </w:p>
-          <w:p>
-            <w:r>
-              <w:t>4. 监管与环境层：个人信息保护法、餐饮行业监管要求、消费者权益保护要求，限定隐私、合规和安全边界。</w:t>
+              <w:t>文字说明：核心层为顾客、注册会员、店员、猫咪管家；业务决策层为店长、门店运营人员、总部运营总监；外部系统与合作方包括支付、短信/小程序、地图和数据分析平台；外部环境层包括个人信息保护法、餐饮监管与消费者权益保护要求。</w:t>
             </w:r>
           </w:p>
         </w:tc>

</xml_diff>